<commit_message>
Design options: a preset's own look, per-block chart and table styles
design.style sets heading colour, a font pairing, text size, figures face,
table header and marking, chart palette/line/grid/labels/legend/threshold,
cover, section numbers, margins, running header and callout treatment over
the theme. An absent key is the theme's choice, so existing presets render
as before. Chart and table slots may carry their own style. Adds the Open
table style, small multiples, and an Average and peak block.

Both validators, the runtime renderers (Word, styled PDF, charts) and the
builder canvas, theme panel and inspector follow the same settings.

Co-Authored-By: Claude Opus 5.5 <noreply@anthropic.com>
Claude-Session: https://claude.ai/code/session_01Ws3sGzsDnQ9xTi2MaiPxFg
</commit_message>
<xml_diff>
--- a/agent/themes/brief.docx
+++ b/agent/themes/brief.docx
@@ -479,6 +479,50 @@
         <w:top w:w="60" w:type="dxa"/>
         <w:left w:w="100" w:type="dxa"/>
         <w:bottom w:w="60" w:type="dxa"/>
+        <w:right w:w="100" w:type="dxa"/>
+      </w:tblCellMar>
+    </w:tblPr>
+    <w:tblStylePr w:type="firstRow">
+      <w:pPr>
+        <w:keepNext/>
+        <w:spacing w:before="0" w:after="0"/>
+      </w:pPr>
+      <w:rPr>
+        <w:rFonts w:ascii="Source Serif 4" w:hAnsi="Source Serif 4" w:cs="Source Serif 4" w:eastAsia="Source Serif 4"/>
+        <w:b/>
+        <w:caps/>
+        <w:color w:val="3D4F8F"/>
+        <w:sz w:val="17"/>
+        <w:szCs w:val="17"/>
+      </w:rPr>
+    </w:tblStylePr>
+  </w:style>
+  <w:style w:type="table" w:styleId="TableOpen">
+    <w:name w:val="Table Open"/>
+    <w:basedOn w:val="NormalTable"/>
+    <w:qFormat/>
+    <w:pPr>
+      <w:spacing w:before="0" w:after="0" w:line="240" w:lineRule="auto"/>
+    </w:pPr>
+    <w:rPr>
+      <w:rFonts w:ascii="Source Sans 3" w:hAnsi="Source Sans 3" w:cs="Source Sans 3" w:eastAsia="Source Sans 3"/>
+      <w:color w:val="1F2128"/>
+      <w:sz w:val="17"/>
+      <w:szCs w:val="17"/>
+    </w:rPr>
+    <w:tblPr>
+      <w:tblBorders>
+        <w:top w:val="none" w:sz="0" w:space="0" w:color="auto"/>
+        <w:left w:val="none" w:sz="0" w:space="0" w:color="auto"/>
+        <w:bottom w:val="none" w:sz="0" w:space="0" w:color="auto"/>
+        <w:right w:val="none" w:sz="0" w:space="0" w:color="auto"/>
+        <w:insideH w:val="none" w:sz="0" w:space="0" w:color="auto"/>
+        <w:insideV w:val="none" w:sz="0" w:space="0" w:color="auto"/>
+      </w:tblBorders>
+      <w:tblCellMar>
+        <w:top w:w="90" w:type="dxa"/>
+        <w:left w:w="100" w:type="dxa"/>
+        <w:bottom w:w="90" w:type="dxa"/>
         <w:right w:w="100" w:type="dxa"/>
       </w:tblCellMar>
     </w:tblPr>

</xml_diff>